<commit_message>
Update V0.14.1 user manual
</commit_message>
<xml_diff>
--- a/documentation/DXAssistant-v0.14.1-beta-User-Manual.docx
+++ b/documentation/DXAssistant-v0.14.1-beta-User-Manual.docx
@@ -3481,6 +3481,7 @@
       <w:pPr>
         <w:pStyle w:val="Heading2"/>
         <w:keepNext/>
+        <w:pageBreakBefore/>
       </w:pPr>
       <w:r>
         <w:t>Supplied band plan</w:t>
@@ -4545,116 +4546,62 @@
     </w:p>
     <w:p>
       <w:pPr>
-        <w:pStyle w:val="ManualNumber"/>
         <w:spacing w:after="80" w:line="300" w:lineRule="auto"/>
-        <w:ind w:left="540" w:hanging="271"/>
-        <w:numPr>
-          <w:numId w:val="105"/>
-        </w:numPr>
+        <w:ind w:left="504" w:hanging="288"/>
+        <w:jc w:val="left"/>
       </w:pPr>
       <w:r>
-        <w:rPr>
-          <w:rFonts w:ascii="Calibri" w:hAnsi="Calibri"/>
-          <w:b w:val="0"/>
-          <w:i w:val="0"/>
-          <w:sz w:val="22"/>
-        </w:rPr>
-        <w:t>Install the Pushover app on the phone, create a Pushover account, and complete its device setup.</w:t>
+        <w:t>1.  Install the Pushover app on the phone, create a Pushover account, and complete its device setup.</w:t>
       </w:r>
     </w:p>
     <w:p>
       <w:pPr>
-        <w:pStyle w:val="ManualNumber"/>
         <w:spacing w:after="80" w:line="300" w:lineRule="auto"/>
-        <w:ind w:left="540" w:hanging="271"/>
-        <w:numPr>
-          <w:numId w:val="105"/>
-        </w:numPr>
+        <w:ind w:left="504" w:hanging="288"/>
+        <w:jc w:val="left"/>
       </w:pPr>
       <w:r>
-        <w:rPr>
-          <w:rFonts w:ascii="Calibri" w:hAnsi="Calibri"/>
-          <w:b w:val="0"/>
-          <w:i w:val="0"/>
-          <w:sz w:val="22"/>
-        </w:rPr>
-        <w:t>Sign in at pushover.net. Copy the 30-character User Key shown on the dashboard.</w:t>
+        <w:t>2.  Sign in at pushover.net. Copy the 30-character User Key shown on the dashboard.</w:t>
       </w:r>
     </w:p>
     <w:p>
       <w:pPr>
-        <w:pStyle w:val="ManualNumber"/>
         <w:spacing w:after="80" w:line="300" w:lineRule="auto"/>
-        <w:ind w:left="540" w:hanging="271"/>
-        <w:numPr>
-          <w:numId w:val="105"/>
-        </w:numPr>
+        <w:ind w:left="504" w:hanging="288"/>
+        <w:jc w:val="left"/>
       </w:pPr>
       <w:r>
-        <w:rPr>
-          <w:rFonts w:ascii="Calibri" w:hAnsi="Calibri"/>
-          <w:b w:val="0"/>
-          <w:i w:val="0"/>
-          <w:sz w:val="22"/>
-        </w:rPr>
-        <w:t>Create an application/API token for DX Assistant at pushover.net/apps and copy its 30-character API Token.</w:t>
+        <w:t>3.  Create an application/API token for DX Assistant at pushover.net/apps and copy its 30-character API Token.</w:t>
       </w:r>
     </w:p>
     <w:p>
       <w:pPr>
-        <w:pStyle w:val="ManualNumber"/>
         <w:spacing w:after="80" w:line="300" w:lineRule="auto"/>
-        <w:ind w:left="540" w:hanging="271"/>
-        <w:numPr>
-          <w:numId w:val="105"/>
-        </w:numPr>
+        <w:ind w:left="504" w:hanging="288"/>
+        <w:jc w:val="left"/>
       </w:pPr>
       <w:r>
-        <w:rPr>
-          <w:rFonts w:ascii="Calibri" w:hAnsi="Calibri"/>
-          <w:b w:val="0"/>
-          <w:i w:val="0"/>
-          <w:sz w:val="22"/>
-        </w:rPr>
-        <w:t>Stop DX Assistant monitoring, then select Mobile alerts in the band-plan controls.</w:t>
+        <w:t>4.  Stop DX Assistant monitoring, then select Mobile alerts in the band-plan controls.</w:t>
       </w:r>
     </w:p>
     <w:p>
       <w:pPr>
-        <w:pStyle w:val="ManualNumber"/>
         <w:spacing w:after="80" w:line="300" w:lineRule="auto"/>
-        <w:ind w:left="540" w:hanging="271"/>
-        <w:numPr>
-          <w:numId w:val="105"/>
-        </w:numPr>
+        <w:ind w:left="504" w:hanging="288"/>
+        <w:jc w:val="left"/>
       </w:pPr>
       <w:r>
-        <w:rPr>
-          <w:rFonts w:ascii="Calibri" w:hAnsi="Calibri"/>
-          <w:b w:val="0"/>
-          <w:i w:val="0"/>
-          <w:sz w:val="22"/>
-        </w:rPr>
-        <w:t>Enter the User Key and API Token, select Enable mobile alerts for target detections, then choose Send test notification.</w:t>
+        <w:t>5.  Enter the User Key and API Token, select Enable mobile alerts for target detections, then choose Send test notification.</w:t>
       </w:r>
     </w:p>
     <w:p>
       <w:pPr>
-        <w:pStyle w:val="ManualNumber"/>
         <w:spacing w:after="80" w:line="300" w:lineRule="auto"/>
-        <w:ind w:left="540" w:hanging="271"/>
-        <w:numPr>
-          <w:numId w:val="105"/>
-        </w:numPr>
+        <w:ind w:left="504" w:hanging="288"/>
+        <w:jc w:val="left"/>
       </w:pPr>
       <w:r>
-        <w:rPr>
-          <w:rFonts w:ascii="Calibri" w:hAnsi="Calibri"/>
-          <w:b w:val="0"/>
-          <w:i w:val="0"/>
-          <w:sz w:val="22"/>
-        </w:rPr>
-        <w:t>Confirm the test arrives on the phone. Choose Save to retain the settings.</w:t>
+        <w:t>6.  Confirm the test arrives on the phone. Choose Save to retain the settings.</w:t>
       </w:r>
     </w:p>
     <w:tbl>
@@ -4732,6 +4679,7 @@
         <w:pStyle w:val="ManualBullet"/>
         <w:spacing w:after="80" w:line="300" w:lineRule="auto"/>
         <w:ind w:left="540" w:hanging="271"/>
+        <w:jc w:val="left"/>
       </w:pPr>
       <w:r>
         <w:t>DX Assistant makes up to three normal-priority delivery attempts when a target alert is newly raised. Because a network timeout can occur after acceptance, a rare duplicate phone notification is possible.</w:t>
@@ -4742,6 +4690,7 @@
         <w:pStyle w:val="ManualBullet"/>
         <w:spacing w:after="80" w:line="300" w:lineRule="auto"/>
         <w:ind w:left="540" w:hanging="271"/>
+        <w:jc w:val="left"/>
       </w:pPr>
       <w:r>
         <w:rPr>
@@ -4758,6 +4707,7 @@
         <w:pStyle w:val="ManualBullet"/>
         <w:spacing w:after="80" w:line="300" w:lineRule="auto"/>
         <w:ind w:left="540" w:hanging="271"/>
+        <w:jc w:val="left"/>
       </w:pPr>
       <w:r>
         <w:rPr>
@@ -4774,6 +4724,7 @@
         <w:pStyle w:val="ManualBullet"/>
         <w:spacing w:after="80" w:line="300" w:lineRule="auto"/>
         <w:ind w:left="540" w:hanging="271"/>
+        <w:jc w:val="left"/>
       </w:pPr>
       <w:r>
         <w:rPr>
@@ -4790,6 +4741,7 @@
         <w:pStyle w:val="ManualBullet"/>
         <w:spacing w:after="80" w:line="300" w:lineRule="auto"/>
         <w:ind w:left="540" w:hanging="271"/>
+        <w:jc w:val="left"/>
       </w:pPr>
       <w:r>
         <w:rPr>
@@ -4806,6 +4758,7 @@
         <w:pStyle w:val="ManualBullet"/>
         <w:spacing w:after="80" w:line="300" w:lineRule="auto"/>
         <w:ind w:left="540" w:hanging="271"/>
+        <w:jc w:val="left"/>
       </w:pPr>
       <w:r>
         <w:rPr>

</xml_diff>